<commit_message>
chore: upload proposal 朝曦培训方案_QUICK-1779083165578_2026527.docx
</commit_message>
<xml_diff>
--- a/public/proposals/朝曦培训方案_QUICK-1779083165578_2026527.docx
+++ b/public/proposals/朝曦培训方案_QUICK-1779083165578_2026527.docx
@@ -44,7 +44,7 @@
           <w:sz w:val="20"/>
           <w:szCs w:val="20"/>
         </w:rPr>
-        <w:t xml:space="preserve">生成时间：2026/5/27 11:24:57</w:t>
+        <w:t xml:space="preserve">生成时间：2026/5/27 11:32:51</w:t>
       </w:r>
     </w:p>
     <w:p>
@@ -74,7 +74,7 @@
           <w:sz w:val="20"/>
           <w:szCs w:val="20"/>
         </w:rPr>
-        <w:t xml:space="preserve">【课程一：企业初创与成长期——股权架构顶层设计与激励落地】</w:t>
+        <w:t xml:space="preserve">【课程四：财富资本化——境外上市与跨境资本路径创新】</w:t>
       </w:r>
     </w:p>
     <w:p>
@@ -88,7 +88,7 @@
           <w:sz w:val="20"/>
           <w:szCs w:val="20"/>
         </w:rPr>
-        <w:t xml:space="preserve">▌ 单元 6：《国际税视野下的持股架构——美籍股东的股权安排"跨国考卷"》</w:t>
+        <w:t xml:space="preserve">▌ 单元 5：《新加坡香港地区家族办公室——给财富安个新家，新港家办的设立与运营》</w:t>
       </w:r>
     </w:p>
     <w:p>
@@ -102,7 +102,7 @@
           <w:sz w:val="20"/>
           <w:szCs w:val="20"/>
         </w:rPr>
-        <w:t xml:space="preserve">  第一部分：美国税制对股权激励的影响——83(b)选举、FICA税、资本利得税与Ordinary Income的区别</w:t>
+        <w:t xml:space="preserve">  第一部分：新港家族办公室的政策框架——监管要求、税务激励与两地对比</w:t>
       </w:r>
     </w:p>
     <w:p>
@@ -116,7 +116,7 @@
           <w:sz w:val="20"/>
           <w:szCs w:val="20"/>
         </w:rPr>
-        <w:t xml:space="preserve">  第二部分：为美籍员工设计激励方案的特殊考量——NSO与ISO的选择、409A估值报告的必要性</w:t>
+        <w:t xml:space="preserve">  第二部分：家族办公室的实质运营要求——雇员、投资与年度合规的核心标准</w:t>
       </w:r>
     </w:p>
     <w:p>
@@ -130,7 +130,7 @@
           <w:sz w:val="20"/>
           <w:szCs w:val="20"/>
         </w:rPr>
-        <w:t xml:space="preserve">  第三部分：利用FGT等美税合规信托持有激励股权的架构与税务分析</w:t>
+        <w:t xml:space="preserve">  第三部分：家族办公室与信托架构的协同设计——NRT结构与财富传承一体化方案</w:t>
       </w:r>
     </w:p>
     <w:p>
@@ -144,7 +144,7 @@
           <w:sz w:val="20"/>
           <w:szCs w:val="20"/>
         </w:rPr>
-        <w:t xml:space="preserve">  第四部分：中美个税申报协同策略与信息披露合规</w:t>
+        <w:t xml:space="preserve">  第四部分：银行在家族办公室生态中的服务定位——账户托管、投资顾问与综合金融服务</w:t>
       </w:r>
     </w:p>
     <w:p>
@@ -172,7 +172,7 @@
           <w:sz w:val="20"/>
           <w:szCs w:val="20"/>
         </w:rPr>
-        <w:t xml:space="preserve">【课程二：业务扩张期——跨境业务架构与税务全景】</w:t>
+        <w:t xml:space="preserve">【课程五：家族永续期——跨境/境内家族信托、税务与治理】</w:t>
       </w:r>
     </w:p>
     <w:p>
@@ -186,7 +186,7 @@
           <w:sz w:val="20"/>
           <w:szCs w:val="20"/>
         </w:rPr>
-        <w:t xml:space="preserve">▌ 单元 5：《境内外信托架构与风险隔离——给家业一道“防火墙”，让经营风险“过不来”》</w:t>
+        <w:t xml:space="preserve">▌ 单元 4：《跨境家族信托——给财富找个“靠谱管家”：信托怎么设、装什么、传给谁》</w:t>
       </w:r>
     </w:p>
     <w:p>
@@ -200,7 +200,7 @@
           <w:sz w:val="20"/>
           <w:szCs w:val="20"/>
         </w:rPr>
-        <w:t xml:space="preserve">  第一部分：企业主财富风险全景——债务、婚姻、继承三大威胁与资产暴露路径</w:t>
+        <w:t xml:space="preserve">  第一部分：信托工具箱——认识境内外各类信托的功能与定位（FGT/NRT/离岸信托）</w:t>
       </w:r>
     </w:p>
     <w:p>
@@ -214,7 +214,7 @@
           <w:sz w:val="20"/>
           <w:szCs w:val="20"/>
         </w:rPr>
-        <w:t xml:space="preserve">  第二部分：境内家族信托架构设计——设立结构、资产注入与银行配套服务</w:t>
+        <w:t xml:space="preserve">  第二部分：信托设立全流程——从方案设计到银行开户</w:t>
       </w:r>
     </w:p>
     <w:p>
@@ -228,7 +228,7 @@
           <w:sz w:val="20"/>
           <w:szCs w:val="20"/>
         </w:rPr>
-        <w:t xml:space="preserve">  第三部分：离岸信托架构设计——隔离机制、管辖选择与CRS合规考量</w:t>
+        <w:t xml:space="preserve">  第三部分：资产注入实务——不同资产类型的路径与挑战</w:t>
       </w:r>
     </w:p>
     <w:p>
@@ -242,105 +242,7 @@
           <w:sz w:val="20"/>
           <w:szCs w:val="20"/>
         </w:rPr>
-        <w:t xml:space="preserve">  第四部分：信托架构的税务合规与长期维护——CRS申报、资产分配税务安排及服务延伸</w:t>
-      </w:r>
-    </w:p>
-    <w:p>
-      <w:pPr>
-        <w:spacing w:after="60"/>
-      </w:pPr>
-      <w:r>
-        <w:rPr>
-          <w:rFonts w:ascii="Courier New" w:cs="Courier New" w:eastAsia="Courier New" w:hAnsi="Courier New"/>
-          <w:color w:val="71717A"/>
-          <w:sz w:val="20"/>
-          <w:szCs w:val="20"/>
-        </w:rPr>
-        <w:t xml:space="preserve"/>
-      </w:r>
-    </w:p>
-    <w:p>
-      <w:pPr>
-        <w:spacing w:after="60"/>
-      </w:pPr>
-      <w:r>
-        <w:rPr>
-          <w:rFonts w:ascii="Courier New" w:cs="Courier New" w:eastAsia="Courier New" w:hAnsi="Courier New"/>
-          <w:color w:val="2D6A4F"/>
-          <w:sz w:val="20"/>
-          <w:szCs w:val="20"/>
-        </w:rPr>
-        <w:t xml:space="preserve">【课程五：家族永续期——跨境/境内家族信托、税务与治理】</w:t>
-      </w:r>
-    </w:p>
-    <w:p>
-      <w:pPr>
-        <w:spacing w:after="60"/>
-      </w:pPr>
-      <w:r>
-        <w:rPr>
-          <w:rFonts w:ascii="Courier New" w:cs="Courier New" w:eastAsia="Courier New" w:hAnsi="Courier New"/>
-          <w:color w:val="18181B"/>
-          <w:sz w:val="20"/>
-          <w:szCs w:val="20"/>
-        </w:rPr>
-        <w:t xml:space="preserve">▌ 单元 3：《中加、中美财富人士规划——如何面对跨洋身份的双重考验》</w:t>
-      </w:r>
-    </w:p>
-    <w:p>
-      <w:pPr>
-        <w:spacing w:after="60"/>
-      </w:pPr>
-      <w:r>
-        <w:rPr>
-          <w:rFonts w:ascii="Courier New" w:cs="Courier New" w:eastAsia="Courier New" w:hAnsi="Courier New"/>
-          <w:color w:val="71717A"/>
-          <w:sz w:val="20"/>
-          <w:szCs w:val="20"/>
-        </w:rPr>
-        <w:t xml:space="preserve">  第一部分：美国身份的税务全景——全球征税义务、FBAR/FATCA与PFIC规则</w:t>
-      </w:r>
-    </w:p>
-    <w:p>
-      <w:pPr>
-        <w:spacing w:after="60"/>
-      </w:pPr>
-      <w:r>
-        <w:rPr>
-          <w:rFonts w:ascii="Courier New" w:cs="Courier New" w:eastAsia="Courier New" w:hAnsi="Courier New"/>
-          <w:color w:val="71717A"/>
-          <w:sz w:val="20"/>
-          <w:szCs w:val="20"/>
-        </w:rPr>
-        <w:t xml:space="preserve">  第二部分：加拿大身份的税务全景——登陆规划、全球申报与加拿大税务优化工具</w:t>
-      </w:r>
-    </w:p>
-    <w:p>
-      <w:pPr>
-        <w:spacing w:after="60"/>
-      </w:pPr>
-      <w:r>
-        <w:rPr>
-          <w:rFonts w:ascii="Courier New" w:cs="Courier New" w:eastAsia="Courier New" w:hAnsi="Courier New"/>
-          <w:color w:val="71717A"/>
-          <w:sz w:val="20"/>
-          <w:szCs w:val="20"/>
-        </w:rPr>
-        <w:t xml:space="preserve">  第三部分：中美/中加双向资产规划——信托、保单与架构设计的合规降税路径</w:t>
-      </w:r>
-    </w:p>
-    <w:p>
-      <w:pPr>
-        <w:spacing w:after="60"/>
-      </w:pPr>
-      <w:r>
-        <w:rPr>
-          <w:rFonts w:ascii="Courier New" w:cs="Courier New" w:eastAsia="Courier New" w:hAnsi="Courier New"/>
-          <w:color w:val="71717A"/>
-          <w:sz w:val="20"/>
-          <w:szCs w:val="20"/>
-        </w:rPr>
-        <w:t xml:space="preserve">  第四部分：双重身份客户的综合服务设计——跨境账户、申报辅助与财富配置的全周期服务</w:t>
+        <w:t xml:space="preserve">  第四部分：风险隔离的效力与边界——客户最关心的问题</w:t>
       </w:r>
     </w:p>
     <w:p>
@@ -356,7 +258,7 @@
           <w:sz w:val="28"/>
           <w:szCs w:val="28"/>
         </w:rPr>
-        <w:t xml:space="preserve">二、客户适配 SKU 列表（共 12 条）</w:t>
+        <w:t xml:space="preserve">二、客户适配 SKU 列表（共 8 条）</w:t>
       </w:r>
     </w:p>
     <w:tbl>
@@ -531,7 +433,7 @@
                 <w:sz w:val="18"/>
                 <w:szCs w:val="18"/>
               </w:rPr>
-              <w:t xml:space="preserve">Tax-2477</w:t>
+              <w:t xml:space="preserve">Tax-2482</w:t>
             </w:r>
           </w:p>
           <w:p>
@@ -543,7 +445,7 @@
                 <w:sz w:val="20"/>
                 <w:szCs w:val="20"/>
               </w:rPr>
-              <w:t xml:space="preserve">NIW</w:t>
+              <w:t xml:space="preserve">海外身份-圣基茨</w:t>
             </w:r>
           </w:p>
         </w:tc>
@@ -570,7 +472,7 @@
                 <w:sz w:val="19"/>
                 <w:szCs w:val="19"/>
               </w:rPr>
-              <w:t xml:space="preserve">美国职业移民第二优先（EB-2）的一种，允许申请人因符合美国国家利益而豁免劳工证申请步骤，自行申请绿卡。</w:t>
+              <w:t xml:space="preserve">通过向圣基茨可持续发展基金捐款或投资房产，获得圣基茨和尼维斯公民身份和护照的投资入籍项目，是最古老的投资入籍项目之一。</w:t>
             </w:r>
           </w:p>
         </w:tc>
@@ -597,7 +499,7 @@
                 <w:sz w:val="19"/>
                 <w:szCs w:val="19"/>
               </w:rPr>
-              <w:t xml:space="preserve">无需雇主担保、无需劳工证、可自行申请、适合高学历人才、审批相对较快</w:t>
+              <w:t xml:space="preserve">历史悠久、免签全球150+国家、无移民监、税制优越、承认双重国籍</w:t>
             </w:r>
           </w:p>
         </w:tc>
@@ -626,7 +528,7 @@
                 <w:sz w:val="19"/>
                 <w:szCs w:val="19"/>
               </w:rPr>
-              <w:t xml:space="preserve">客户需求为移民美国，NIW适用于高学历人才，无需雇主担保，符合移民场景。</w:t>
+              <w:t xml:space="preserve">客户明确提到‘圣基茨移民’，该产品直接对应圣基茨护照申请，满足出行便利、税务筹划等需求。</w:t>
             </w:r>
           </w:p>
         </w:tc>
@@ -656,7 +558,7 @@
                 <w:sz w:val="18"/>
                 <w:szCs w:val="18"/>
               </w:rPr>
-              <w:t xml:space="preserve">Tax-2480</w:t>
+              <w:t xml:space="preserve">Tax-2450</w:t>
             </w:r>
           </w:p>
           <w:p>
@@ -668,7 +570,7 @@
                 <w:sz w:val="20"/>
                 <w:szCs w:val="20"/>
               </w:rPr>
-              <w:t xml:space="preserve">EB1A</w:t>
+              <w:t xml:space="preserve">海外身份-格林纳达</w:t>
             </w:r>
           </w:p>
         </w:tc>
@@ -695,7 +597,7 @@
                 <w:sz w:val="19"/>
                 <w:szCs w:val="19"/>
               </w:rPr>
-              <w:t xml:space="preserve">美国职业移民第一优先（EB-1）类别，针对在科学、艺术、教育、商业或体育领域具有杰出能力的人才，无需雇主担保即可申请绿卡。</w:t>
+              <w:t xml:space="preserve">通过向格林纳达国家发展基金捐款或投资房产，获得格林纳达公民身份和护照的项目。</w:t>
             </w:r>
           </w:p>
         </w:tc>
@@ -722,7 +624,7 @@
                 <w:sz w:val="19"/>
                 <w:szCs w:val="19"/>
               </w:rPr>
-              <w:t xml:space="preserve">无需雇主担保、无需劳工证、排期较短、全家绿卡、适合顶尖人才</w:t>
+              <w:t xml:space="preserve">E-2签证跳板（可申请美国E-2投资者签证）、免签中国、通行全球140+国家、税务筹划（无全球征税）、资产配置</w:t>
             </w:r>
           </w:p>
         </w:tc>
@@ -751,7 +653,7 @@
                 <w:sz w:val="19"/>
                 <w:szCs w:val="19"/>
               </w:rPr>
-              <w:t xml:space="preserve">客户需求为移民美国，EB1A适用于行业顶尖人才，可快速获得绿卡，无需雇主。</w:t>
+              <w:t xml:space="preserve">客户可能考虑加勒比护照，格林纳达与圣基茨类似，可提供E-2签证赴美等附加价值，作为备选方案。</w:t>
             </w:r>
           </w:p>
         </w:tc>
@@ -781,7 +683,7 @@
                 <w:sz w:val="18"/>
                 <w:szCs w:val="18"/>
               </w:rPr>
-              <w:t xml:space="preserve">Tax-2483</w:t>
+              <w:t xml:space="preserve">Tax-2479</w:t>
             </w:r>
           </w:p>
           <w:p>
@@ -793,7 +695,7 @@
                 <w:sz w:val="20"/>
                 <w:szCs w:val="20"/>
               </w:rPr>
-              <w:t xml:space="preserve">EB5</w:t>
+              <w:t xml:space="preserve">海外身份-瓦努阿图</w:t>
             </w:r>
           </w:p>
         </w:tc>
@@ -820,7 +722,7 @@
                 <w:sz w:val="19"/>
                 <w:szCs w:val="19"/>
               </w:rPr>
-              <w:t xml:space="preserve">美国移民法规定的第五类职业移民类别，通过向美国商业企业投资并创造就业机会，获得美国绿卡。</w:t>
+              <w:t xml:space="preserve">通过向瓦努阿图国家发展基金捐款，获得瓦努阿图公民身份和护照的投资入籍项目。</w:t>
             </w:r>
           </w:p>
         </w:tc>
@@ -847,7 +749,7 @@
                 <w:sz w:val="19"/>
                 <w:szCs w:val="19"/>
               </w:rPr>
-              <w:t xml:space="preserve">无学历、语言、年龄要求、全家绿卡、可同时申请、无排期时快速</w:t>
+              <w:t xml:space="preserve">快速获批（1-2个月）、免签全球100+国家、无移民监、税制优越（无所得税、遗产税）、可改名</w:t>
             </w:r>
           </w:p>
         </w:tc>
@@ -876,7 +778,7 @@
                 <w:sz w:val="19"/>
                 <w:szCs w:val="19"/>
               </w:rPr>
-              <w:t xml:space="preserve">客户需求为移民美国，EB5适用于有资金但不符合人才类要求的客户，通过投资获得全家绿卡。</w:t>
+              <w:t xml:space="preserve">瓦努阿图护照快速获取，适合客户对比不同护照项目，满足快速出行和税务筹划需求。</w:t>
             </w:r>
           </w:p>
         </w:tc>
@@ -906,7 +808,7 @@
                 <w:sz w:val="18"/>
                 <w:szCs w:val="18"/>
               </w:rPr>
-              <w:t xml:space="preserve">Tax-2587</w:t>
+              <w:t xml:space="preserve">Tax-2481</w:t>
             </w:r>
           </w:p>
           <w:p>
@@ -918,7 +820,7 @@
                 <w:sz w:val="20"/>
                 <w:szCs w:val="20"/>
               </w:rPr>
-              <w:t xml:space="preserve">美国-登陆前美国个税咨询</w:t>
+              <w:t xml:space="preserve">海外身份-多米尼克</w:t>
             </w:r>
           </w:p>
         </w:tc>
@@ -945,7 +847,7 @@
                 <w:sz w:val="19"/>
                 <w:szCs w:val="19"/>
               </w:rPr>
-              <w:t xml:space="preserve">针对拟移民美国（拿绿卡）的客户，在成为美国税务居民前，就个人所得税相关问题提供咨询，包括资产处置、收入时间安排等。</w:t>
+              <w:t xml:space="preserve">通过向多米尼克经济多元化基金捐款或投资房产，获得多米尼克公民身份和护照的投资入籍项目。</w:t>
             </w:r>
           </w:p>
         </w:tc>
@@ -972,7 +874,7 @@
                 <w:sz w:val="19"/>
                 <w:szCs w:val="19"/>
               </w:rPr>
-              <w:t xml:space="preserve">优化未来税负、规划资产出售时点、避免双重征税</w:t>
+              <w:t xml:space="preserve">低成本、免签全球140+国家、无移民监、税制优越、承认双重国籍</w:t>
             </w:r>
           </w:p>
         </w:tc>
@@ -1001,7 +903,7 @@
                 <w:sz w:val="19"/>
                 <w:szCs w:val="19"/>
               </w:rPr>
-              <w:t xml:space="preserve">客户需求为移民美国，登陆前个税咨询可帮助规划全球征税问题，降低未来税负。</w:t>
+              <w:t xml:space="preserve">多米尼克护照低成本，与圣基茨同属加勒比项目，客户可综合比较性价比。</w:t>
             </w:r>
           </w:p>
         </w:tc>
@@ -1031,7 +933,7 @@
                 <w:sz w:val="18"/>
                 <w:szCs w:val="18"/>
               </w:rPr>
-              <w:t xml:space="preserve">Tax-2588</w:t>
+              <w:t xml:space="preserve">Tax-2484</w:t>
             </w:r>
           </w:p>
           <w:p>
@@ -1043,7 +945,7 @@
                 <w:sz w:val="20"/>
                 <w:szCs w:val="20"/>
               </w:rPr>
-              <w:t xml:space="preserve">美国-登陆前资产安排咨询</w:t>
+              <w:t xml:space="preserve">海外身份-马耳他</w:t>
             </w:r>
           </w:p>
         </w:tc>
@@ -1070,7 +972,7 @@
                 <w:sz w:val="19"/>
                 <w:szCs w:val="19"/>
               </w:rPr>
-              <w:t xml:space="preserve">针对拟移民美国的客户，在成为美国税务居民前，就其资产（房产、股权、信托）进行架构调整和税务优化咨询。</w:t>
+              <w:t xml:space="preserve">通过向马耳他国家发展基金捐款、投资房产和购买国债/股票，获得马耳他公民身份和护照的项目，是欧盟护照中较有吸引力的项目。</w:t>
             </w:r>
           </w:p>
         </w:tc>
@@ -1097,7 +999,7 @@
                 <w:sz w:val="19"/>
                 <w:szCs w:val="19"/>
               </w:rPr>
-              <w:t xml:space="preserve">优化资产持有结构、规避遗产税、保护资产</w:t>
+              <w:t xml:space="preserve">欧盟护照、免签美国、英国、申根国、英语国家、税制优越、承认双重国籍</w:t>
             </w:r>
           </w:p>
         </w:tc>
@@ -1126,7 +1028,7 @@
                 <w:sz w:val="19"/>
                 <w:szCs w:val="19"/>
               </w:rPr>
-              <w:t xml:space="preserve">客户需求为移民美国，登陆前资产安排咨询可优化房产、股权持有结构，规避遗产税。</w:t>
+              <w:t xml:space="preserve">马耳他护照提供欧盟身份，适合客户考虑更高含金量的护照选项，满足自由定居欧盟需求。</w:t>
             </w:r>
           </w:p>
         </w:tc>
@@ -1156,7 +1058,7 @@
                 <w:sz w:val="18"/>
                 <w:szCs w:val="18"/>
               </w:rPr>
-              <w:t xml:space="preserve">CM2343</w:t>
+              <w:t xml:space="preserve">Tax-2407</w:t>
             </w:r>
           </w:p>
           <w:p>
@@ -1168,7 +1070,7 @@
                 <w:sz w:val="20"/>
                 <w:szCs w:val="20"/>
               </w:rPr>
-              <w:t xml:space="preserve">境内-FGT</w:t>
+              <w:t xml:space="preserve">家庭资产纳税义务合规复核</w:t>
             </w:r>
           </w:p>
         </w:tc>
@@ -1195,7 +1097,7 @@
                 <w:sz w:val="19"/>
                 <w:szCs w:val="19"/>
               </w:rPr>
-              <w:t xml:space="preserve">在中国境内设立的、通过特定条款设计使其符合美国税法下“委托人信托”（Grantor Trust）定义的信托，用于美籍受益人税务优化。</w:t>
+              <w:t xml:space="preserve">对家族成员名下各类资产（境内/境外、股权/房产/金融资产）的涉税合规性进行全面梳理和风险排查的服务。</w:t>
             </w:r>
           </w:p>
         </w:tc>
@@ -1222,7 +1124,7 @@
                 <w:sz w:val="19"/>
                 <w:szCs w:val="19"/>
               </w:rPr>
-              <w:t xml:space="preserve">美税合规：信托分配美国税务居民受益人接收分配无税；资产隔离保护</w:t>
+              <w:t xml:space="preserve">全面排查税务风险、发现隐形雷区（如境外金融账户未申报）、应对CRS信息交换、为移民前规划提供依据、避免未来高额罚款</w:t>
             </w:r>
           </w:p>
         </w:tc>
@@ -1251,7 +1153,7 @@
                 <w:sz w:val="19"/>
                 <w:szCs w:val="19"/>
               </w:rPr>
-              <w:t xml:space="preserve">客户需求为移民美国，境内FGT可帮助有美籍子女的客户筹划美国税，满足合规要求。</w:t>
+              <w:t xml:space="preserve">移民圣基茨后需梳理全球资产税务，该产品帮助客户复核家庭资产纳税义务，避免CRS风险。</w:t>
             </w:r>
           </w:p>
         </w:tc>
@@ -1281,7 +1183,7 @@
                 <w:sz w:val="18"/>
                 <w:szCs w:val="18"/>
               </w:rPr>
-              <w:t xml:space="preserve">CM2349</w:t>
+              <w:t xml:space="preserve">Tax-2471</w:t>
             </w:r>
           </w:p>
           <w:p>
@@ -1293,7 +1195,7 @@
                 <w:sz w:val="20"/>
                 <w:szCs w:val="20"/>
               </w:rPr>
-              <w:t xml:space="preserve">离岸信托-FGT</w:t>
+              <w:t xml:space="preserve">CRS涉税风险复核</w:t>
             </w:r>
           </w:p>
         </w:tc>
@@ -1320,7 +1222,7 @@
                 <w:sz w:val="19"/>
                 <w:szCs w:val="19"/>
               </w:rPr>
-              <w:t xml:space="preserve">在离岸地设立的、通过特定条款设计使其符合美国税法下“委托人信托”（Grantor Trust）定义的信托，用于美籍受益人税务优化。</w:t>
+              <w:t xml:space="preserve">针对个人或企业在CRS（共同申报标准）下的信息交换情况，进行涉税风险排查和合规建议的服务，协助客户CRS相关的税务应对和税务申报。</w:t>
             </w:r>
           </w:p>
         </w:tc>
@@ -1347,7 +1249,7 @@
                 <w:sz w:val="19"/>
                 <w:szCs w:val="19"/>
               </w:rPr>
-              <w:t xml:space="preserve">美籍子女规划首选（资产增值对美籍子女“零税”传递）、避免美国遗产税/赠与税、由非美籍委托人纳税、隐私保护</w:t>
+              <w:t xml:space="preserve">应对CRS信息交换、发现信息不对称风险、避免被税务机关质疑、合规整改、保护资产隐私</w:t>
             </w:r>
           </w:p>
         </w:tc>
@@ -1376,7 +1278,7 @@
                 <w:sz w:val="19"/>
                 <w:szCs w:val="19"/>
               </w:rPr>
-              <w:t xml:space="preserve">客户需求为移民美国，离岸FGT可帮助有美籍子女的客户将离岸资产传给子女，避免美国赠与税/遗产税。</w:t>
+              <w:t xml:space="preserve">客户移民后海外账户可能面临CRS信息交换，该产品帮助排查涉税风险，确保合规。</w:t>
             </w:r>
           </w:p>
         </w:tc>
@@ -1406,7 +1308,7 @@
                 <w:sz w:val="18"/>
                 <w:szCs w:val="18"/>
               </w:rPr>
-              <w:t xml:space="preserve">CM2351</w:t>
+              <w:t xml:space="preserve">Tax-2543</w:t>
             </w:r>
           </w:p>
           <w:p>
@@ -1418,7 +1320,7 @@
                 <w:sz w:val="20"/>
                 <w:szCs w:val="20"/>
               </w:rPr>
-              <w:t xml:space="preserve">美国信托-ILIT信托</w:t>
+              <w:t xml:space="preserve">中国个税汇算清缴（境内+境外收入）</w:t>
             </w:r>
           </w:p>
         </w:tc>
@@ -1445,7 +1347,7 @@
                 <w:sz w:val="19"/>
                 <w:szCs w:val="19"/>
               </w:rPr>
-              <w:t xml:space="preserve">在美国设立的不可撤销信托，专门用于持有美国人寿保险保单，将理赔金排除在委托人遗产之外，规避美国遗产税。</w:t>
+              <w:t xml:space="preserve">中国税务居民个人就其全球收入（含境外收入）进行年度个税汇算清缴，并进行境外税收抵免的服务。</w:t>
             </w:r>
           </w:p>
         </w:tc>
@@ -1472,7 +1374,7 @@
                 <w:sz w:val="19"/>
                 <w:szCs w:val="19"/>
               </w:rPr>
-              <w:t xml:space="preserve">规避遗产税（理赔金移出遗产税计算范围）、资产保护、定向传承、税务优化</w:t>
+              <w:t xml:space="preserve">全球征税落地、避免双重征税（抵免）、合规申报、应对CRS信息比对、高净值人群合规重点</w:t>
             </w:r>
           </w:p>
         </w:tc>
@@ -1501,507 +1403,7 @@
                 <w:sz w:val="19"/>
                 <w:szCs w:val="19"/>
               </w:rPr>
-              <w:t xml:space="preserve">客户需求为移民美国，美国ILIT信托可持有美国人寿保单，使理赔金免税给子女，规避遗产税。</w:t>
-            </w:r>
-          </w:p>
-        </w:tc>
-      </w:tr>
-      <w:tr>
-        <w:tc>
-          <w:tcPr>
-            <w:tcW w:type="dxa" w:w="1400"/>
-            <w:tcBorders>
-              <w:top w:val="single" w:color="CCCCCC" w:sz="1"/>
-              <w:left w:val="single" w:color="CCCCCC" w:sz="1"/>
-              <w:bottom w:val="single" w:color="CCCCCC" w:sz="1"/>
-              <w:right w:val="single" w:color="CCCCCC" w:sz="1"/>
-            </w:tcBorders>
-            <w:tcMar>
-              <w:top w:type="dxa" w:w="80"/>
-              <w:left w:type="dxa" w:w="120"/>
-              <w:bottom w:type="dxa" w:w="80"/>
-              <w:right w:type="dxa" w:w="120"/>
-            </w:tcMar>
-          </w:tcPr>
-          <w:p>
-            <w:r>
-              <w:rPr>
-                <w:rFonts w:ascii="Arial" w:cs="Arial" w:eastAsia="Arial" w:hAnsi="Arial"/>
-                <w:color w:val="6B7280"/>
-                <w:sz w:val="18"/>
-                <w:szCs w:val="18"/>
-              </w:rPr>
-              <w:t xml:space="preserve">CM2352</w:t>
-            </w:r>
-          </w:p>
-          <w:p>
-            <w:r>
-              <w:rPr>
-                <w:rFonts w:ascii="Arial" w:cs="Arial" w:eastAsia="Arial" w:hAnsi="Arial"/>
-                <w:b/>
-                <w:bCs/>
-                <w:sz w:val="20"/>
-                <w:szCs w:val="20"/>
-              </w:rPr>
-              <w:t xml:space="preserve">美国信托-Standby信托</w:t>
-            </w:r>
-          </w:p>
-        </w:tc>
-        <w:tc>
-          <w:tcPr>
-            <w:tcW w:type="dxa" w:w="2200"/>
-            <w:tcBorders>
-              <w:top w:val="single" w:color="CCCCCC" w:sz="1"/>
-              <w:left w:val="single" w:color="CCCCCC" w:sz="1"/>
-              <w:bottom w:val="single" w:color="CCCCCC" w:sz="1"/>
-              <w:right w:val="single" w:color="CCCCCC" w:sz="1"/>
-            </w:tcBorders>
-            <w:tcMar>
-              <w:top w:type="dxa" w:w="80"/>
-              <w:left w:type="dxa" w:w="120"/>
-              <w:bottom w:type="dxa" w:w="80"/>
-              <w:right w:type="dxa" w:w="120"/>
-            </w:tcMar>
-          </w:tcPr>
-          <w:p>
-            <w:r>
-              <w:rPr>
-                <w:rFonts w:ascii="Arial" w:cs="Arial" w:eastAsia="Arial" w:hAnsi="Arial"/>
-                <w:sz w:val="19"/>
-                <w:szCs w:val="19"/>
-              </w:rPr>
-              <w:t xml:space="preserve">在美国设立的可撤销生前信托，平时资产未注入（或少量注入），配合FGT，在委托人去世后资产注入信托，避免遗嘱认证。</w:t>
-            </w:r>
-          </w:p>
-        </w:tc>
-        <w:tc>
-          <w:tcPr>
-            <w:tcW w:type="dxa" w:w="3200"/>
-            <w:tcBorders>
-              <w:top w:val="single" w:color="CCCCCC" w:sz="1"/>
-              <w:left w:val="single" w:color="CCCCCC" w:sz="1"/>
-              <w:bottom w:val="single" w:color="CCCCCC" w:sz="1"/>
-              <w:right w:val="single" w:color="CCCCCC" w:sz="1"/>
-            </w:tcBorders>
-            <w:tcMar>
-              <w:top w:type="dxa" w:w="80"/>
-              <w:left w:type="dxa" w:w="120"/>
-              <w:bottom w:type="dxa" w:w="80"/>
-              <w:right w:type="dxa" w:w="120"/>
-            </w:tcMar>
-          </w:tcPr>
-          <w:p>
-            <w:r>
-              <w:rPr>
-                <w:rFonts w:ascii="Arial" w:cs="Arial" w:eastAsia="Arial" w:hAnsi="Arial"/>
-                <w:sz w:val="19"/>
-                <w:szCs w:val="19"/>
-              </w:rPr>
-              <w:t xml:space="preserve">隐私保护、灵活可变、便于管理</w:t>
-            </w:r>
-          </w:p>
-        </w:tc>
-        <w:tc>
-          <w:tcPr>
-            <w:tcW w:type="dxa" w:w="2400"/>
-            <w:tcBorders>
-              <w:top w:val="single" w:color="CCCCCC" w:sz="1"/>
-              <w:left w:val="single" w:color="CCCCCC" w:sz="1"/>
-              <w:bottom w:val="single" w:color="CCCCCC" w:sz="1"/>
-              <w:right w:val="single" w:color="CCCCCC" w:sz="1"/>
-            </w:tcBorders>
-            <w:shd w:fill="F0FDF4" w:val="clear"/>
-            <w:tcMar>
-              <w:top w:type="dxa" w:w="80"/>
-              <w:left w:type="dxa" w:w="120"/>
-              <w:bottom w:type="dxa" w:w="80"/>
-              <w:right w:type="dxa" w:w="120"/>
-            </w:tcMar>
-          </w:tcPr>
-          <w:p>
-            <w:r>
-              <w:rPr>
-                <w:rFonts w:ascii="Arial" w:cs="Arial" w:eastAsia="Arial" w:hAnsi="Arial"/>
-                <w:color w:val="065F46"/>
-                <w:sz w:val="19"/>
-                <w:szCs w:val="19"/>
-              </w:rPr>
-              <w:t xml:space="preserve">客户需求为移民美国，美国Standby信托可避免遗嘱认证程序，简单有效传承美国资产。</w:t>
-            </w:r>
-          </w:p>
-        </w:tc>
-      </w:tr>
-      <w:tr>
-        <w:tc>
-          <w:tcPr>
-            <w:tcW w:type="dxa" w:w="1400"/>
-            <w:tcBorders>
-              <w:top w:val="single" w:color="CCCCCC" w:sz="1"/>
-              <w:left w:val="single" w:color="CCCCCC" w:sz="1"/>
-              <w:bottom w:val="single" w:color="CCCCCC" w:sz="1"/>
-              <w:right w:val="single" w:color="CCCCCC" w:sz="1"/>
-            </w:tcBorders>
-            <w:tcMar>
-              <w:top w:type="dxa" w:w="80"/>
-              <w:left w:type="dxa" w:w="120"/>
-              <w:bottom w:type="dxa" w:w="80"/>
-              <w:right w:type="dxa" w:w="120"/>
-            </w:tcMar>
-          </w:tcPr>
-          <w:p>
-            <w:r>
-              <w:rPr>
-                <w:rFonts w:ascii="Arial" w:cs="Arial" w:eastAsia="Arial" w:hAnsi="Arial"/>
-                <w:color w:val="6B7280"/>
-                <w:sz w:val="18"/>
-                <w:szCs w:val="18"/>
-              </w:rPr>
-              <w:t xml:space="preserve">CM2364</w:t>
-            </w:r>
-          </w:p>
-          <w:p>
-            <w:r>
-              <w:rPr>
-                <w:rFonts w:ascii="Arial" w:cs="Arial" w:eastAsia="Arial" w:hAnsi="Arial"/>
-                <w:b/>
-                <w:bCs/>
-                <w:sz w:val="20"/>
-                <w:szCs w:val="20"/>
-              </w:rPr>
-              <w:t xml:space="preserve">美国大额保单-IUL</w:t>
-            </w:r>
-          </w:p>
-        </w:tc>
-        <w:tc>
-          <w:tcPr>
-            <w:tcW w:type="dxa" w:w="2200"/>
-            <w:tcBorders>
-              <w:top w:val="single" w:color="CCCCCC" w:sz="1"/>
-              <w:left w:val="single" w:color="CCCCCC" w:sz="1"/>
-              <w:bottom w:val="single" w:color="CCCCCC" w:sz="1"/>
-              <w:right w:val="single" w:color="CCCCCC" w:sz="1"/>
-            </w:tcBorders>
-            <w:tcMar>
-              <w:top w:type="dxa" w:w="80"/>
-              <w:left w:type="dxa" w:w="120"/>
-              <w:bottom w:type="dxa" w:w="80"/>
-              <w:right w:type="dxa" w:w="120"/>
-            </w:tcMar>
-          </w:tcPr>
-          <w:p>
-            <w:r>
-              <w:rPr>
-                <w:rFonts w:ascii="Arial" w:cs="Arial" w:eastAsia="Arial" w:hAnsi="Arial"/>
-                <w:sz w:val="19"/>
-                <w:szCs w:val="19"/>
-              </w:rPr>
-              <w:t xml:space="preserve">在美国本土发行的指数型万能寿险，基于美国生命表，费率极低，杠杆极高，适合有美国关联的高净值人士。</w:t>
-            </w:r>
-          </w:p>
-        </w:tc>
-        <w:tc>
-          <w:tcPr>
-            <w:tcW w:type="dxa" w:w="3200"/>
-            <w:tcBorders>
-              <w:top w:val="single" w:color="CCCCCC" w:sz="1"/>
-              <w:left w:val="single" w:color="CCCCCC" w:sz="1"/>
-              <w:bottom w:val="single" w:color="CCCCCC" w:sz="1"/>
-              <w:right w:val="single" w:color="CCCCCC" w:sz="1"/>
-            </w:tcBorders>
-            <w:tcMar>
-              <w:top w:type="dxa" w:w="80"/>
-              <w:left w:type="dxa" w:w="120"/>
-              <w:bottom w:type="dxa" w:w="80"/>
-              <w:right w:type="dxa" w:w="120"/>
-            </w:tcMar>
-          </w:tcPr>
-          <w:p>
-            <w:r>
-              <w:rPr>
-                <w:rFonts w:ascii="Arial" w:cs="Arial" w:eastAsia="Arial" w:hAnsi="Arial"/>
-                <w:sz w:val="19"/>
-                <w:szCs w:val="19"/>
-              </w:rPr>
-              <w:t xml:space="preserve">极高杠杆、美税合规、保底收益、灵活缴费、现金价值增长</w:t>
-            </w:r>
-          </w:p>
-        </w:tc>
-        <w:tc>
-          <w:tcPr>
-            <w:tcW w:type="dxa" w:w="2400"/>
-            <w:tcBorders>
-              <w:top w:val="single" w:color="CCCCCC" w:sz="1"/>
-              <w:left w:val="single" w:color="CCCCCC" w:sz="1"/>
-              <w:bottom w:val="single" w:color="CCCCCC" w:sz="1"/>
-              <w:right w:val="single" w:color="CCCCCC" w:sz="1"/>
-            </w:tcBorders>
-            <w:shd w:fill="F0FDF4" w:val="clear"/>
-            <w:tcMar>
-              <w:top w:type="dxa" w:w="80"/>
-              <w:left w:type="dxa" w:w="120"/>
-              <w:bottom w:type="dxa" w:w="80"/>
-              <w:right w:type="dxa" w:w="120"/>
-            </w:tcMar>
-          </w:tcPr>
-          <w:p>
-            <w:r>
-              <w:rPr>
-                <w:rFonts w:ascii="Arial" w:cs="Arial" w:eastAsia="Arial" w:hAnsi="Arial"/>
-                <w:color w:val="065F46"/>
-                <w:sz w:val="19"/>
-                <w:szCs w:val="19"/>
-              </w:rPr>
-              <w:t xml:space="preserve">客户需求为移民美国，美国IUL保单可提供高保额、优化美国遗产税，适合有美国身份或资产者。</w:t>
-            </w:r>
-          </w:p>
-        </w:tc>
-      </w:tr>
-      <w:tr>
-        <w:tc>
-          <w:tcPr>
-            <w:tcW w:type="dxa" w:w="1400"/>
-            <w:tcBorders>
-              <w:top w:val="single" w:color="CCCCCC" w:sz="1"/>
-              <w:left w:val="single" w:color="CCCCCC" w:sz="1"/>
-              <w:bottom w:val="single" w:color="CCCCCC" w:sz="1"/>
-              <w:right w:val="single" w:color="CCCCCC" w:sz="1"/>
-            </w:tcBorders>
-            <w:tcMar>
-              <w:top w:type="dxa" w:w="80"/>
-              <w:left w:type="dxa" w:w="120"/>
-              <w:bottom w:type="dxa" w:w="80"/>
-              <w:right w:type="dxa" w:w="120"/>
-            </w:tcMar>
-          </w:tcPr>
-          <w:p>
-            <w:r>
-              <w:rPr>
-                <w:rFonts w:ascii="Arial" w:cs="Arial" w:eastAsia="Arial" w:hAnsi="Arial"/>
-                <w:color w:val="6B7280"/>
-                <w:sz w:val="18"/>
-                <w:szCs w:val="18"/>
-              </w:rPr>
-              <w:t xml:space="preserve">Tax-2544</w:t>
-            </w:r>
-          </w:p>
-          <w:p>
-            <w:r>
-              <w:rPr>
-                <w:rFonts w:ascii="Arial" w:cs="Arial" w:eastAsia="Arial" w:hAnsi="Arial"/>
-                <w:b/>
-                <w:bCs/>
-                <w:sz w:val="20"/>
-                <w:szCs w:val="20"/>
-              </w:rPr>
-              <w:t xml:space="preserve">美国个税年度申报-1040R</w:t>
-            </w:r>
-          </w:p>
-        </w:tc>
-        <w:tc>
-          <w:tcPr>
-            <w:tcW w:type="dxa" w:w="2200"/>
-            <w:tcBorders>
-              <w:top w:val="single" w:color="CCCCCC" w:sz="1"/>
-              <w:left w:val="single" w:color="CCCCCC" w:sz="1"/>
-              <w:bottom w:val="single" w:color="CCCCCC" w:sz="1"/>
-              <w:right w:val="single" w:color="CCCCCC" w:sz="1"/>
-            </w:tcBorders>
-            <w:tcMar>
-              <w:top w:type="dxa" w:w="80"/>
-              <w:left w:type="dxa" w:w="120"/>
-              <w:bottom w:type="dxa" w:w="80"/>
-              <w:right w:type="dxa" w:w="120"/>
-            </w:tcMar>
-          </w:tcPr>
-          <w:p>
-            <w:r>
-              <w:rPr>
-                <w:rFonts w:ascii="Arial" w:cs="Arial" w:eastAsia="Arial" w:hAnsi="Arial"/>
-                <w:sz w:val="19"/>
-                <w:szCs w:val="19"/>
-              </w:rPr>
-              <w:t xml:space="preserve">美国税务居民（公民、绿卡持有人、满足实质居住测试者）的年度个人所得税申报服务（Form 1040）。</w:t>
-            </w:r>
-          </w:p>
-        </w:tc>
-        <w:tc>
-          <w:tcPr>
-            <w:tcW w:type="dxa" w:w="3200"/>
-            <w:tcBorders>
-              <w:top w:val="single" w:color="CCCCCC" w:sz="1"/>
-              <w:left w:val="single" w:color="CCCCCC" w:sz="1"/>
-              <w:bottom w:val="single" w:color="CCCCCC" w:sz="1"/>
-              <w:right w:val="single" w:color="CCCCCC" w:sz="1"/>
-            </w:tcBorders>
-            <w:tcMar>
-              <w:top w:type="dxa" w:w="80"/>
-              <w:left w:type="dxa" w:w="120"/>
-              <w:bottom w:type="dxa" w:w="80"/>
-              <w:right w:type="dxa" w:w="120"/>
-            </w:tcMar>
-          </w:tcPr>
-          <w:p>
-            <w:r>
-              <w:rPr>
-                <w:rFonts w:ascii="Arial" w:cs="Arial" w:eastAsia="Arial" w:hAnsi="Arial"/>
-                <w:sz w:val="19"/>
-                <w:szCs w:val="19"/>
-              </w:rPr>
-              <w:t xml:space="preserve">基础合规、全球收入申报、避免罚款、申请退税、应对IRS稽查</w:t>
-            </w:r>
-          </w:p>
-        </w:tc>
-        <w:tc>
-          <w:tcPr>
-            <w:tcW w:type="dxa" w:w="2400"/>
-            <w:tcBorders>
-              <w:top w:val="single" w:color="CCCCCC" w:sz="1"/>
-              <w:left w:val="single" w:color="CCCCCC" w:sz="1"/>
-              <w:bottom w:val="single" w:color="CCCCCC" w:sz="1"/>
-              <w:right w:val="single" w:color="CCCCCC" w:sz="1"/>
-            </w:tcBorders>
-            <w:shd w:fill="F0FDF4" w:val="clear"/>
-            <w:tcMar>
-              <w:top w:type="dxa" w:w="80"/>
-              <w:left w:type="dxa" w:w="120"/>
-              <w:bottom w:type="dxa" w:w="80"/>
-              <w:right w:type="dxa" w:w="120"/>
-            </w:tcMar>
-          </w:tcPr>
-          <w:p>
-            <w:r>
-              <w:rPr>
-                <w:rFonts w:ascii="Arial" w:cs="Arial" w:eastAsia="Arial" w:hAnsi="Arial"/>
-                <w:color w:val="065F46"/>
-                <w:sz w:val="19"/>
-                <w:szCs w:val="19"/>
-              </w:rPr>
-              <w:t xml:space="preserve">客户需求为移民美国，美国个税年度申报1040R适用于美国公民/绿卡持有人，确保全球收入合规申报。</w:t>
-            </w:r>
-          </w:p>
-        </w:tc>
-      </w:tr>
-      <w:tr>
-        <w:tc>
-          <w:tcPr>
-            <w:tcW w:type="dxa" w:w="1400"/>
-            <w:tcBorders>
-              <w:top w:val="single" w:color="CCCCCC" w:sz="1"/>
-              <w:left w:val="single" w:color="CCCCCC" w:sz="1"/>
-              <w:bottom w:val="single" w:color="CCCCCC" w:sz="1"/>
-              <w:right w:val="single" w:color="CCCCCC" w:sz="1"/>
-            </w:tcBorders>
-            <w:tcMar>
-              <w:top w:type="dxa" w:w="80"/>
-              <w:left w:type="dxa" w:w="120"/>
-              <w:bottom w:type="dxa" w:w="80"/>
-              <w:right w:type="dxa" w:w="120"/>
-            </w:tcMar>
-          </w:tcPr>
-          <w:p>
-            <w:r>
-              <w:rPr>
-                <w:rFonts w:ascii="Arial" w:cs="Arial" w:eastAsia="Arial" w:hAnsi="Arial"/>
-                <w:color w:val="6B7280"/>
-                <w:sz w:val="18"/>
-                <w:szCs w:val="18"/>
-              </w:rPr>
-              <w:t xml:space="preserve">Tax-2549</w:t>
-            </w:r>
-          </w:p>
-          <w:p>
-            <w:r>
-              <w:rPr>
-                <w:rFonts w:ascii="Arial" w:cs="Arial" w:eastAsia="Arial" w:hAnsi="Arial"/>
-                <w:b/>
-                <w:bCs/>
-                <w:sz w:val="20"/>
-                <w:szCs w:val="20"/>
-              </w:rPr>
-              <w:t xml:space="preserve">美国个税年度申报-FINCEN114</w:t>
-            </w:r>
-          </w:p>
-        </w:tc>
-        <w:tc>
-          <w:tcPr>
-            <w:tcW w:type="dxa" w:w="2200"/>
-            <w:tcBorders>
-              <w:top w:val="single" w:color="CCCCCC" w:sz="1"/>
-              <w:left w:val="single" w:color="CCCCCC" w:sz="1"/>
-              <w:bottom w:val="single" w:color="CCCCCC" w:sz="1"/>
-              <w:right w:val="single" w:color="CCCCCC" w:sz="1"/>
-            </w:tcBorders>
-            <w:tcMar>
-              <w:top w:type="dxa" w:w="80"/>
-              <w:left w:type="dxa" w:w="120"/>
-              <w:bottom w:type="dxa" w:w="80"/>
-              <w:right w:type="dxa" w:w="120"/>
-            </w:tcMar>
-          </w:tcPr>
-          <w:p>
-            <w:r>
-              <w:rPr>
-                <w:rFonts w:ascii="Arial" w:cs="Arial" w:eastAsia="Arial" w:hAnsi="Arial"/>
-                <w:sz w:val="19"/>
-                <w:szCs w:val="19"/>
-              </w:rPr>
-              <w:t xml:space="preserve">美国纳税人（包括公民、绿卡、居民）在海外银行账户总额超过$1万时，需向FinCEN申报FBAR（FinCEN Form 114）。</w:t>
-            </w:r>
-          </w:p>
-        </w:tc>
-        <w:tc>
-          <w:tcPr>
-            <w:tcW w:type="dxa" w:w="3200"/>
-            <w:tcBorders>
-              <w:top w:val="single" w:color="CCCCCC" w:sz="1"/>
-              <w:left w:val="single" w:color="CCCCCC" w:sz="1"/>
-              <w:bottom w:val="single" w:color="CCCCCC" w:sz="1"/>
-              <w:right w:val="single" w:color="CCCCCC" w:sz="1"/>
-            </w:tcBorders>
-            <w:tcMar>
-              <w:top w:type="dxa" w:w="80"/>
-              <w:left w:type="dxa" w:w="120"/>
-              <w:bottom w:type="dxa" w:w="80"/>
-              <w:right w:type="dxa" w:w="120"/>
-            </w:tcMar>
-          </w:tcPr>
-          <w:p>
-            <w:r>
-              <w:rPr>
-                <w:rFonts w:ascii="Arial" w:cs="Arial" w:eastAsia="Arial" w:hAnsi="Arial"/>
-                <w:sz w:val="19"/>
-                <w:szCs w:val="19"/>
-              </w:rPr>
-              <w:t xml:space="preserve">反洗钱、非故意违规罚款$1万、故意违规罚款$10万或50%账户余额、刑事风险、合规必备</w:t>
-            </w:r>
-          </w:p>
-        </w:tc>
-        <w:tc>
-          <w:tcPr>
-            <w:tcW w:type="dxa" w:w="2400"/>
-            <w:tcBorders>
-              <w:top w:val="single" w:color="CCCCCC" w:sz="1"/>
-              <w:left w:val="single" w:color="CCCCCC" w:sz="1"/>
-              <w:bottom w:val="single" w:color="CCCCCC" w:sz="1"/>
-              <w:right w:val="single" w:color="CCCCCC" w:sz="1"/>
-            </w:tcBorders>
-            <w:shd w:fill="F0FDF4" w:val="clear"/>
-            <w:tcMar>
-              <w:top w:type="dxa" w:w="80"/>
-              <w:left w:type="dxa" w:w="120"/>
-              <w:bottom w:type="dxa" w:w="80"/>
-              <w:right w:type="dxa" w:w="120"/>
-            </w:tcMar>
-          </w:tcPr>
-          <w:p>
-            <w:r>
-              <w:rPr>
-                <w:rFonts w:ascii="Arial" w:cs="Arial" w:eastAsia="Arial" w:hAnsi="Arial"/>
-                <w:color w:val="065F46"/>
-                <w:sz w:val="19"/>
-                <w:szCs w:val="19"/>
-              </w:rPr>
-              <w:t xml:space="preserve">客户需求为移民美国，FBAR申报要求海外账户超1万美元需申报，避免漏报罚款。</w:t>
+              <w:t xml:space="preserve">客户获得圣基茨身份后，若仍有中国境内收入，需合规申报个税并处理境外税收抵免，该产品提供专业支持。</w:t>
             </w:r>
           </w:p>
         </w:tc>

</xml_diff>